<commit_message>
Rev G updates: referee swap (RAAF/CPB), Langtrees credit, PL status
Co-Authored-By: Claude Opus 5.5 <noreply@anthropic.com>
Claude-Session: https://claude.ai/code/session_01RKGFyarCMuMinKYL7AiBap
</commit_message>
<xml_diff>
--- a/FP/TN-1640786/Final/JCE_FP_TN-1640786_Final_RevG.docx
+++ b/FP/TN-1640786/Final/JCE_FP_TN-1640786_Final_RevG.docx
@@ -2873,7 +2873,7 @@
     <w:p>
       <w:pPr>
         <w:pStyle w:val="ListBullet"/>
-        <w:keepNext/>
+        <w:keepNext w:val="0"/>
         <w:spacing w:after="40"/>
       </w:pPr>
       <w:r>
@@ -2894,7 +2894,7 @@
     <w:p>
       <w:pPr>
         <w:pStyle w:val="ListBullet"/>
-        <w:keepNext/>
+        <w:keepNext w:val="0"/>
         <w:spacing w:after="40"/>
       </w:pPr>
       <w:r>
@@ -2915,7 +2915,7 @@
     <w:p>
       <w:pPr>
         <w:pStyle w:val="ListBullet"/>
-        <w:keepNext/>
+        <w:keepNext w:val="0"/>
         <w:spacing w:after="40"/>
       </w:pPr>
       <w:r>
@@ -2936,7 +2936,7 @@
     <w:p>
       <w:pPr>
         <w:pStyle w:val="ListBullet"/>
-        <w:keepNext/>
+        <w:keepNext w:val="0"/>
         <w:spacing w:after="40"/>
       </w:pPr>
       <w:r>
@@ -2957,7 +2957,7 @@
     <w:p>
       <w:pPr>
         <w:pStyle w:val="ListBullet"/>
-        <w:keepNext/>
+        <w:keepNext w:val="0"/>
         <w:spacing w:after="40"/>
       </w:pPr>
       <w:r>
@@ -2973,6 +2973,27 @@
           <w:i w:val="0"/>
         </w:rPr>
         <w:t>Has worked for a regional council in Far North Queensland, including shortlisting consultants for a council tender.</w:t>
+      </w:r>
+    </w:p>
+    <w:p>
+      <w:pPr>
+        <w:pStyle w:val="ListBullet"/>
+        <w:keepNext w:val="0"/>
+        <w:spacing w:after="40"/>
+      </w:pPr>
+      <w:r>
+        <w:rPr>
+          <w:b/>
+          <w:i w:val="0"/>
+        </w:rPr>
+        <w:t xml:space="preserve">Council projects (Jayden Callen, while at Langtrees). </w:t>
+      </w:r>
+      <w:r>
+        <w:rPr>
+          <w:b w:val="0"/>
+          <w:i w:val="0"/>
+        </w:rPr>
+        <w:t>Floodway rectification, Tablelands Regional Council (QLD): engineering for the rectification of a floodway on Council's road network. Leachate storage facility, Tablelands Regional Council (QLD): engineering for a landfill leachate storage facility. Referee: Darren Quilliam, Tablelands Regional Council.</w:t>
       </w:r>
     </w:p>
     <w:p>
@@ -3122,6 +3143,20 @@
           <w:i w:val="0"/>
         </w:rPr>
         <w:t>Maverick Partner, CPB Contractors (RAAF Base Townsville, Defence delivery project). Contact details available on request.</w:t>
+      </w:r>
+    </w:p>
+    <w:p>
+      <w:pPr>
+        <w:pStyle w:val="ListBullet"/>
+        <w:keepNext/>
+        <w:spacing w:after="40"/>
+      </w:pPr>
+      <w:r>
+        <w:rPr>
+          <w:b w:val="0"/>
+          <w:i w:val="0"/>
+        </w:rPr>
+        <w:t>Darren Quilliam, Tablelands Regional Council (Jayden's Tablelands projects while at Langtrees). Contact details available on request.</w:t>
       </w:r>
     </w:p>
     <w:p>

</xml_diff>